<commit_message>
week one Final Day
</commit_message>
<xml_diff>
--- a/01-threats-and-principles/notes/Cybersecurity_Weeks_1_and_2_Study_Guide.docx
+++ b/01-threats-and-principles/notes/Cybersecurity_Weeks_1_and_2_Study_Guide.docx
@@ -2813,71 +2813,6 @@
       <w:pPr>
         <w:spacing w:after="60"/>
       </w:pPr>
-    </w:p>
-    <w:p>
-      <w:pPr>
-        <w:spacing w:after="60"/>
-      </w:pPr>
-    </w:p>
-    <w:p>
-      <w:pPr>
-        <w:spacing w:after="60"/>
-      </w:pPr>
-    </w:p>
-    <w:p>
-      <w:pPr>
-        <w:spacing w:after="60"/>
-      </w:pPr>
-    </w:p>
-    <w:p>
-      <w:pPr>
-        <w:spacing w:after="60"/>
-      </w:pPr>
-    </w:p>
-    <w:p>
-      <w:pPr>
-        <w:spacing w:after="60"/>
-      </w:pPr>
-    </w:p>
-    <w:p>
-      <w:pPr>
-        <w:spacing w:after="60"/>
-      </w:pPr>
-    </w:p>
-    <w:p>
-      <w:pPr>
-        <w:spacing w:after="60"/>
-      </w:pPr>
-    </w:p>
-    <w:p>
-      <w:pPr>
-        <w:spacing w:after="60"/>
-      </w:pPr>
-    </w:p>
-    <w:p>
-      <w:pPr>
-        <w:spacing w:after="60"/>
-      </w:pPr>
-    </w:p>
-    <w:p>
-      <w:pPr>
-        <w:spacing w:after="60"/>
-      </w:pPr>
-    </w:p>
-    <w:p>
-      <w:pPr>
-        <w:spacing w:after="60"/>
-      </w:pPr>
-    </w:p>
-    <w:p>
-      <w:pPr>
-        <w:spacing w:after="60"/>
-      </w:pPr>
-    </w:p>
-    <w:p>
-      <w:pPr>
-        <w:spacing w:after="60"/>
-      </w:pPr>
       <w:r>
         <w:t>Floor 5 — MALWARE        "Victim Takes Bait / Works Alone / Really Sneaky / Ransomware shouts"</w:t>
       </w:r>
@@ -3119,7 +3054,6 @@
                 <w:bCs/>
                 <w:color w:val="1F3864"/>
               </w:rPr>
-              <w:lastRenderedPageBreak/>
               <w:t>TIP — Connect the dots</w:t>
             </w:r>
           </w:p>
@@ -3191,6 +3125,7 @@
     </w:p>
     <w:p>
       <w:r>
+        <w:lastRenderedPageBreak/>
         <w:br w:type="page"/>
       </w:r>
     </w:p>
@@ -3329,6 +3264,10 @@
         <w:t xml:space="preserve">   A) </w:t>
       </w:r>
       <w:r>
+        <w:rPr>
+          <w:b/>
+          <w:bCs/>
+        </w:rPr>
         <w:t>Confidentiality only</w:t>
       </w:r>
     </w:p>
@@ -3441,6 +3380,10 @@
         <w:t xml:space="preserve">   C) </w:t>
       </w:r>
       <w:r>
+        <w:rPr>
+          <w:b/>
+          <w:bCs/>
+        </w:rPr>
         <w:t>Worm</w:t>
       </w:r>
     </w:p>
@@ -5376,6 +5319,1902 @@
         <w:t>. No encryption — just threat of publication. Common in 2023+ as some groups dropped encryption entirely.</w:t>
       </w:r>
     </w:p>
+    <w:p/>
+    <w:p/>
+    <w:p/>
+    <w:p>
+      <w:pPr>
+        <w:spacing w:before="120" w:after="60"/>
+      </w:pPr>
+      <w:r>
+        <w:t>Exam:</w:t>
+      </w:r>
+      <w:r>
+        <w:rPr>
+          <w:b/>
+          <w:bCs/>
+          <w:color w:val="1F3864"/>
+        </w:rPr>
+        <w:t xml:space="preserve"> </w:t>
+      </w:r>
+      <w:r>
+        <w:rPr>
+          <w:b/>
+          <w:bCs/>
+          <w:color w:val="1F3864"/>
+        </w:rPr>
+        <w:t xml:space="preserve">Q1. </w:t>
+      </w:r>
+      <w:r>
+        <w:t>An attacker sends a tailored email to the CFO asking her to wire money to a new vendor. What is this?</w:t>
+      </w:r>
+    </w:p>
+    <w:p>
+      <w:pPr>
+        <w:spacing w:after="30"/>
+        <w:ind w:left="360"/>
+        <w:rPr>
+          <w:b/>
+          <w:bCs/>
+        </w:rPr>
+      </w:pPr>
+      <w:r>
+        <w:rPr>
+          <w:b/>
+          <w:bCs/>
+        </w:rPr>
+        <w:t xml:space="preserve">   </w:t>
+      </w:r>
+      <w:r>
+        <w:rPr>
+          <w:b/>
+          <w:bCs/>
+          <w:color w:val="EE0000"/>
+        </w:rPr>
+        <w:t>A)</w:t>
+      </w:r>
+      <w:r>
+        <w:rPr>
+          <w:b/>
+          <w:bCs/>
+          <w:i/>
+          <w:iCs/>
+          <w:color w:val="EE0000"/>
+        </w:rPr>
+        <w:t xml:space="preserve"> Phishing</w:t>
+      </w:r>
+    </w:p>
+    <w:p>
+      <w:pPr>
+        <w:spacing w:after="30"/>
+        <w:ind w:left="360"/>
+      </w:pPr>
+      <w:r>
+        <w:rPr>
+          <w:b/>
+          <w:bCs/>
+        </w:rPr>
+        <w:t xml:space="preserve">   B) </w:t>
+      </w:r>
+      <w:r>
+        <w:t>Spear phishing</w:t>
+      </w:r>
+    </w:p>
+    <w:p>
+      <w:pPr>
+        <w:spacing w:after="30"/>
+        <w:ind w:left="360"/>
+      </w:pPr>
+      <w:r>
+        <w:rPr>
+          <w:b/>
+          <w:bCs/>
+        </w:rPr>
+        <w:t xml:space="preserve">   </w:t>
+      </w:r>
+      <w:r>
+        <w:rPr>
+          <w:b/>
+          <w:bCs/>
+          <w:color w:val="47D459" w:themeColor="accent3" w:themeTint="99"/>
+        </w:rPr>
+        <w:t xml:space="preserve">C) </w:t>
+      </w:r>
+      <w:r>
+        <w:rPr>
+          <w:color w:val="47D459" w:themeColor="accent3" w:themeTint="99"/>
+        </w:rPr>
+        <w:t>Whaling</w:t>
+      </w:r>
+    </w:p>
+    <w:p>
+      <w:pPr>
+        <w:spacing w:after="30"/>
+        <w:ind w:left="360"/>
+      </w:pPr>
+      <w:r>
+        <w:rPr>
+          <w:b/>
+          <w:bCs/>
+        </w:rPr>
+        <w:t xml:space="preserve">   D) </w:t>
+      </w:r>
+      <w:r>
+        <w:t>Vishing</w:t>
+      </w:r>
+    </w:p>
+    <w:p>
+      <w:pPr>
+        <w:spacing w:before="120" w:after="60"/>
+      </w:pPr>
+      <w:r>
+        <w:rPr>
+          <w:b/>
+          <w:bCs/>
+          <w:color w:val="1F3864"/>
+        </w:rPr>
+        <w:t xml:space="preserve">Q2. </w:t>
+      </w:r>
+      <w:r>
+        <w:t>Which leg of the CIA triad is most directly attacked by ransomware?</w:t>
+      </w:r>
+    </w:p>
+    <w:p>
+      <w:pPr>
+        <w:spacing w:after="30"/>
+        <w:ind w:left="360"/>
+      </w:pPr>
+      <w:r>
+        <w:rPr>
+          <w:b/>
+          <w:bCs/>
+        </w:rPr>
+        <w:t xml:space="preserve">   A) </w:t>
+      </w:r>
+      <w:r>
+        <w:rPr>
+          <w:b/>
+          <w:bCs/>
+          <w:i/>
+          <w:iCs/>
+        </w:rPr>
+        <w:t>Confidentiality only</w:t>
+      </w:r>
+    </w:p>
+    <w:p>
+      <w:pPr>
+        <w:spacing w:after="30"/>
+        <w:ind w:left="360"/>
+      </w:pPr>
+      <w:r>
+        <w:rPr>
+          <w:b/>
+          <w:bCs/>
+        </w:rPr>
+        <w:t xml:space="preserve">   B) </w:t>
+      </w:r>
+      <w:r>
+        <w:rPr>
+          <w:color w:val="47D459" w:themeColor="accent3" w:themeTint="99"/>
+        </w:rPr>
+        <w:t>Availability (primarily) and sometimes confidentiality</w:t>
+      </w:r>
+    </w:p>
+    <w:p>
+      <w:pPr>
+        <w:spacing w:after="30"/>
+        <w:ind w:left="360"/>
+      </w:pPr>
+      <w:r>
+        <w:rPr>
+          <w:b/>
+          <w:bCs/>
+        </w:rPr>
+        <w:t xml:space="preserve">   C) </w:t>
+      </w:r>
+      <w:r>
+        <w:t>Integrity only</w:t>
+      </w:r>
+    </w:p>
+    <w:p>
+      <w:pPr>
+        <w:spacing w:after="30"/>
+        <w:ind w:left="360"/>
+      </w:pPr>
+      <w:r>
+        <w:rPr>
+          <w:b/>
+          <w:bCs/>
+        </w:rPr>
+        <w:t xml:space="preserve">   D) </w:t>
+      </w:r>
+      <w:r>
+        <w:t>None of the above</w:t>
+      </w:r>
+    </w:p>
+    <w:p>
+      <w:pPr>
+        <w:spacing w:before="120" w:after="60"/>
+      </w:pPr>
+      <w:r>
+        <w:rPr>
+          <w:b/>
+          <w:bCs/>
+          <w:color w:val="1F3864"/>
+        </w:rPr>
+        <w:t xml:space="preserve">Q3. </w:t>
+      </w:r>
+      <w:r>
+        <w:t>What type of malware self-replicates across a network without user action?</w:t>
+      </w:r>
+    </w:p>
+    <w:p>
+      <w:pPr>
+        <w:spacing w:after="30"/>
+        <w:ind w:left="360"/>
+      </w:pPr>
+      <w:r>
+        <w:rPr>
+          <w:b/>
+          <w:bCs/>
+        </w:rPr>
+        <w:t xml:space="preserve">   A) </w:t>
+      </w:r>
+      <w:r>
+        <w:t>Virus</w:t>
+      </w:r>
+    </w:p>
+    <w:p>
+      <w:pPr>
+        <w:spacing w:after="30"/>
+        <w:ind w:left="360"/>
+      </w:pPr>
+      <w:r>
+        <w:rPr>
+          <w:b/>
+          <w:bCs/>
+        </w:rPr>
+        <w:t xml:space="preserve">   B) </w:t>
+      </w:r>
+      <w:r>
+        <w:t>Trojan</w:t>
+      </w:r>
+    </w:p>
+    <w:p>
+      <w:pPr>
+        <w:spacing w:after="30"/>
+        <w:ind w:left="360"/>
+        <w:rPr>
+          <w:color w:val="47D459" w:themeColor="accent3" w:themeTint="99"/>
+        </w:rPr>
+      </w:pPr>
+      <w:r>
+        <w:rPr>
+          <w:b/>
+          <w:bCs/>
+          <w:color w:val="47D459" w:themeColor="accent3" w:themeTint="99"/>
+        </w:rPr>
+        <w:t xml:space="preserve">   C) </w:t>
+      </w:r>
+      <w:r>
+        <w:rPr>
+          <w:b/>
+          <w:bCs/>
+          <w:i/>
+          <w:iCs/>
+          <w:color w:val="47D459" w:themeColor="accent3" w:themeTint="99"/>
+        </w:rPr>
+        <w:t>Worm</w:t>
+      </w:r>
+    </w:p>
+    <w:p>
+      <w:pPr>
+        <w:spacing w:after="30"/>
+        <w:ind w:left="360"/>
+      </w:pPr>
+      <w:r>
+        <w:rPr>
+          <w:b/>
+          <w:bCs/>
+        </w:rPr>
+        <w:t xml:space="preserve">   D) </w:t>
+      </w:r>
+      <w:r>
+        <w:t>Spyware</w:t>
+      </w:r>
+    </w:p>
+    <w:p>
+      <w:pPr>
+        <w:spacing w:before="120" w:after="60"/>
+      </w:pPr>
+      <w:r>
+        <w:rPr>
+          <w:b/>
+          <w:bCs/>
+          <w:color w:val="1F3864"/>
+        </w:rPr>
+        <w:t xml:space="preserve">Q4. </w:t>
+      </w:r>
+      <w:r>
+        <w:t>A vulnerability for which no patch yet exists is called a:</w:t>
+      </w:r>
+    </w:p>
+    <w:p>
+      <w:pPr>
+        <w:spacing w:after="30"/>
+        <w:ind w:left="360"/>
+      </w:pPr>
+      <w:r>
+        <w:rPr>
+          <w:b/>
+          <w:bCs/>
+        </w:rPr>
+        <w:t xml:space="preserve">   A) </w:t>
+      </w:r>
+      <w:r>
+        <w:t>Logic bomb</w:t>
+      </w:r>
+    </w:p>
+    <w:p>
+      <w:pPr>
+        <w:spacing w:after="30"/>
+        <w:ind w:left="360"/>
+      </w:pPr>
+      <w:r>
+        <w:rPr>
+          <w:b/>
+          <w:bCs/>
+        </w:rPr>
+        <w:t xml:space="preserve">   </w:t>
+      </w:r>
+      <w:r>
+        <w:rPr>
+          <w:b/>
+          <w:bCs/>
+          <w:color w:val="47D459" w:themeColor="accent3" w:themeTint="99"/>
+        </w:rPr>
+        <w:t xml:space="preserve">B) </w:t>
+      </w:r>
+      <w:r>
+        <w:rPr>
+          <w:b/>
+          <w:bCs/>
+          <w:i/>
+          <w:iCs/>
+          <w:color w:val="47D459" w:themeColor="accent3" w:themeTint="99"/>
+        </w:rPr>
+        <w:t>Zero-day</w:t>
+      </w:r>
+    </w:p>
+    <w:p>
+      <w:pPr>
+        <w:spacing w:after="30"/>
+        <w:ind w:left="360"/>
+      </w:pPr>
+      <w:r>
+        <w:rPr>
+          <w:b/>
+          <w:bCs/>
+        </w:rPr>
+        <w:t xml:space="preserve">   C) </w:t>
+      </w:r>
+      <w:r>
+        <w:t>Backdoor</w:t>
+      </w:r>
+    </w:p>
+    <w:p>
+      <w:pPr>
+        <w:spacing w:after="30"/>
+        <w:ind w:left="360"/>
+      </w:pPr>
+      <w:r>
+        <w:rPr>
+          <w:b/>
+          <w:bCs/>
+        </w:rPr>
+        <w:t xml:space="preserve">   D) </w:t>
+      </w:r>
+      <w:r>
+        <w:t>Race condition</w:t>
+      </w:r>
+    </w:p>
+    <w:p>
+      <w:pPr>
+        <w:spacing w:before="120" w:after="60"/>
+      </w:pPr>
+      <w:r>
+        <w:rPr>
+          <w:b/>
+          <w:bCs/>
+          <w:color w:val="1F3864"/>
+        </w:rPr>
+        <w:t xml:space="preserve">Q5. </w:t>
+      </w:r>
+      <w:r>
+        <w:t>Which actor is best characterized by long-term, well-funded, geopolitical motivation?</w:t>
+      </w:r>
+    </w:p>
+    <w:p>
+      <w:pPr>
+        <w:spacing w:after="30"/>
+        <w:ind w:left="360"/>
+      </w:pPr>
+      <w:r>
+        <w:rPr>
+          <w:b/>
+          <w:bCs/>
+        </w:rPr>
+        <w:t xml:space="preserve">   A) </w:t>
+      </w:r>
+      <w:r>
+        <w:t>Script kiddie</w:t>
+      </w:r>
+    </w:p>
+    <w:p>
+      <w:pPr>
+        <w:spacing w:after="30"/>
+        <w:ind w:left="360"/>
+      </w:pPr>
+      <w:r>
+        <w:rPr>
+          <w:b/>
+          <w:bCs/>
+        </w:rPr>
+        <w:t xml:space="preserve">   B) </w:t>
+      </w:r>
+      <w:r>
+        <w:t>Hacktivist</w:t>
+      </w:r>
+    </w:p>
+    <w:p>
+      <w:pPr>
+        <w:spacing w:after="30"/>
+        <w:ind w:left="360"/>
+        <w:rPr>
+          <w:color w:val="47D459" w:themeColor="accent3" w:themeTint="99"/>
+        </w:rPr>
+      </w:pPr>
+      <w:r>
+        <w:rPr>
+          <w:b/>
+          <w:bCs/>
+          <w:color w:val="47D459" w:themeColor="accent3" w:themeTint="99"/>
+        </w:rPr>
+        <w:t xml:space="preserve">   C) </w:t>
+      </w:r>
+      <w:r>
+        <w:rPr>
+          <w:b/>
+          <w:bCs/>
+          <w:i/>
+          <w:iCs/>
+          <w:color w:val="47D459" w:themeColor="accent3" w:themeTint="99"/>
+        </w:rPr>
+        <w:t>Nation-state</w:t>
+      </w:r>
+    </w:p>
+    <w:p>
+      <w:pPr>
+        <w:spacing w:after="30"/>
+        <w:ind w:left="360"/>
+      </w:pPr>
+      <w:r>
+        <w:rPr>
+          <w:b/>
+          <w:bCs/>
+        </w:rPr>
+        <w:t xml:space="preserve">   D) </w:t>
+      </w:r>
+      <w:r>
+        <w:t>Insider</w:t>
+      </w:r>
+    </w:p>
+    <w:p>
+      <w:pPr>
+        <w:spacing w:before="120" w:after="60"/>
+      </w:pPr>
+      <w:r>
+        <w:rPr>
+          <w:b/>
+          <w:bCs/>
+          <w:color w:val="1F3864"/>
+        </w:rPr>
+        <w:t xml:space="preserve">Q6. </w:t>
+      </w:r>
+      <w:r>
+        <w:t>An attacker hides malware at the kernel level so antivirus tools can't see running processes. This is a:</w:t>
+      </w:r>
+    </w:p>
+    <w:p>
+      <w:pPr>
+        <w:spacing w:after="30"/>
+        <w:ind w:left="360"/>
+      </w:pPr>
+      <w:r>
+        <w:rPr>
+          <w:b/>
+          <w:bCs/>
+        </w:rPr>
+        <w:t xml:space="preserve">   </w:t>
+      </w:r>
+      <w:r>
+        <w:rPr>
+          <w:b/>
+          <w:bCs/>
+          <w:color w:val="47D459" w:themeColor="accent3" w:themeTint="99"/>
+        </w:rPr>
+        <w:t xml:space="preserve">A) </w:t>
+      </w:r>
+      <w:r>
+        <w:rPr>
+          <w:color w:val="47D459" w:themeColor="accent3" w:themeTint="99"/>
+        </w:rPr>
+        <w:t>Rootkit</w:t>
+      </w:r>
+    </w:p>
+    <w:p>
+      <w:pPr>
+        <w:spacing w:after="30"/>
+        <w:ind w:left="360"/>
+        <w:rPr>
+          <w:color w:val="EE0000"/>
+        </w:rPr>
+      </w:pPr>
+      <w:r>
+        <w:rPr>
+          <w:b/>
+          <w:bCs/>
+          <w:color w:val="EE0000"/>
+        </w:rPr>
+        <w:lastRenderedPageBreak/>
+        <w:t xml:space="preserve">   B) </w:t>
+      </w:r>
+      <w:r>
+        <w:rPr>
+          <w:b/>
+          <w:bCs/>
+          <w:i/>
+          <w:iCs/>
+          <w:color w:val="EE0000"/>
+        </w:rPr>
+        <w:t>Trojan</w:t>
+      </w:r>
+    </w:p>
+    <w:p>
+      <w:pPr>
+        <w:spacing w:after="30"/>
+        <w:ind w:left="360"/>
+      </w:pPr>
+      <w:r>
+        <w:rPr>
+          <w:b/>
+          <w:bCs/>
+        </w:rPr>
+        <w:t xml:space="preserve">   C) </w:t>
+      </w:r>
+      <w:r>
+        <w:t>Worm</w:t>
+      </w:r>
+    </w:p>
+    <w:p>
+      <w:pPr>
+        <w:spacing w:after="30"/>
+        <w:ind w:left="360"/>
+      </w:pPr>
+      <w:r>
+        <w:rPr>
+          <w:b/>
+          <w:bCs/>
+        </w:rPr>
+        <w:t xml:space="preserve">   D) </w:t>
+      </w:r>
+      <w:r>
+        <w:t>Adware</w:t>
+      </w:r>
+    </w:p>
+    <w:p>
+      <w:pPr>
+        <w:spacing w:before="120" w:after="60"/>
+      </w:pPr>
+      <w:r>
+        <w:rPr>
+          <w:b/>
+          <w:bCs/>
+          <w:color w:val="1F3864"/>
+        </w:rPr>
+        <w:t xml:space="preserve">Q7. </w:t>
+      </w:r>
+      <w:r>
+        <w:t>Capital One's 2019 breach was primarily caused by:</w:t>
+      </w:r>
+    </w:p>
+    <w:p>
+      <w:pPr>
+        <w:spacing w:after="30"/>
+        <w:ind w:left="360"/>
+      </w:pPr>
+      <w:r>
+        <w:rPr>
+          <w:b/>
+          <w:bCs/>
+        </w:rPr>
+        <w:t xml:space="preserve">   A) </w:t>
+      </w:r>
+      <w:r>
+        <w:t>A zero-day in AWS</w:t>
+      </w:r>
+    </w:p>
+    <w:p>
+      <w:pPr>
+        <w:spacing w:after="30"/>
+        <w:ind w:left="360"/>
+        <w:rPr>
+          <w:color w:val="47D459" w:themeColor="accent3" w:themeTint="99"/>
+        </w:rPr>
+      </w:pPr>
+      <w:r>
+        <w:rPr>
+          <w:b/>
+          <w:bCs/>
+          <w:color w:val="47D459" w:themeColor="accent3" w:themeTint="99"/>
+        </w:rPr>
+        <w:t xml:space="preserve">   B) </w:t>
+      </w:r>
+      <w:r>
+        <w:rPr>
+          <w:b/>
+          <w:bCs/>
+          <w:i/>
+          <w:iCs/>
+          <w:color w:val="47D459" w:themeColor="accent3" w:themeTint="99"/>
+        </w:rPr>
+        <w:t>A misconfigured WAF and over-permissive IAM role</w:t>
+      </w:r>
+    </w:p>
+    <w:p>
+      <w:pPr>
+        <w:spacing w:after="30"/>
+        <w:ind w:left="360"/>
+      </w:pPr>
+      <w:r>
+        <w:rPr>
+          <w:b/>
+          <w:bCs/>
+        </w:rPr>
+        <w:t xml:space="preserve">   C) </w:t>
+      </w:r>
+      <w:r>
+        <w:t>A phishing email</w:t>
+      </w:r>
+    </w:p>
+    <w:p>
+      <w:pPr>
+        <w:spacing w:after="30"/>
+        <w:ind w:left="360"/>
+      </w:pPr>
+      <w:r>
+        <w:rPr>
+          <w:b/>
+          <w:bCs/>
+        </w:rPr>
+        <w:t xml:space="preserve">   D) </w:t>
+      </w:r>
+      <w:r>
+        <w:t>Ransomware</w:t>
+      </w:r>
+    </w:p>
+    <w:p>
+      <w:pPr>
+        <w:spacing w:before="120" w:after="60"/>
+      </w:pPr>
+      <w:r>
+        <w:rPr>
+          <w:b/>
+          <w:bCs/>
+          <w:color w:val="1F3864"/>
+        </w:rPr>
+        <w:t xml:space="preserve">Q8. </w:t>
+      </w:r>
+      <w:r>
+        <w:t>Malware that triggers only on a specific date is called a:</w:t>
+      </w:r>
+    </w:p>
+    <w:p>
+      <w:pPr>
+        <w:spacing w:after="30"/>
+        <w:ind w:left="360"/>
+      </w:pPr>
+      <w:r>
+        <w:rPr>
+          <w:b/>
+          <w:bCs/>
+        </w:rPr>
+        <w:t xml:space="preserve">   A) </w:t>
+      </w:r>
+      <w:r>
+        <w:t>Worm</w:t>
+      </w:r>
+    </w:p>
+    <w:p>
+      <w:pPr>
+        <w:spacing w:after="30"/>
+        <w:ind w:left="360"/>
+        <w:rPr>
+          <w:color w:val="47D459" w:themeColor="accent3" w:themeTint="99"/>
+        </w:rPr>
+      </w:pPr>
+      <w:r>
+        <w:rPr>
+          <w:b/>
+          <w:bCs/>
+          <w:color w:val="47D459" w:themeColor="accent3" w:themeTint="99"/>
+        </w:rPr>
+        <w:t xml:space="preserve">   B) </w:t>
+      </w:r>
+      <w:r>
+        <w:rPr>
+          <w:b/>
+          <w:bCs/>
+          <w:i/>
+          <w:iCs/>
+          <w:color w:val="47D459" w:themeColor="accent3" w:themeTint="99"/>
+        </w:rPr>
+        <w:t>Logic bomb</w:t>
+      </w:r>
+    </w:p>
+    <w:p>
+      <w:pPr>
+        <w:spacing w:after="30"/>
+        <w:ind w:left="360"/>
+      </w:pPr>
+      <w:r>
+        <w:rPr>
+          <w:b/>
+          <w:bCs/>
+        </w:rPr>
+        <w:t xml:space="preserve">   C) </w:t>
+      </w:r>
+      <w:r>
+        <w:t>Trojan</w:t>
+      </w:r>
+    </w:p>
+    <w:p>
+      <w:pPr>
+        <w:spacing w:after="30"/>
+        <w:ind w:left="360"/>
+      </w:pPr>
+      <w:r>
+        <w:rPr>
+          <w:b/>
+          <w:bCs/>
+        </w:rPr>
+        <w:t xml:space="preserve">   D) </w:t>
+      </w:r>
+      <w:r>
+        <w:t>Keylogger</w:t>
+      </w:r>
+    </w:p>
+    <w:p>
+      <w:pPr>
+        <w:spacing w:before="120" w:after="60"/>
+      </w:pPr>
+      <w:r>
+        <w:rPr>
+          <w:b/>
+          <w:bCs/>
+          <w:color w:val="1F3864"/>
+        </w:rPr>
+        <w:t xml:space="preserve">Q9. </w:t>
+      </w:r>
+      <w:r>
+        <w:t>An attacker compromises a website that they know the target visits regularly. This is:</w:t>
+      </w:r>
+    </w:p>
+    <w:p>
+      <w:pPr>
+        <w:spacing w:after="30"/>
+        <w:ind w:left="360"/>
+      </w:pPr>
+      <w:r>
+        <w:rPr>
+          <w:b/>
+          <w:bCs/>
+        </w:rPr>
+        <w:t xml:space="preserve">   A) </w:t>
+      </w:r>
+      <w:r>
+        <w:t>Spear phishing</w:t>
+      </w:r>
+    </w:p>
+    <w:p>
+      <w:pPr>
+        <w:spacing w:after="30"/>
+        <w:ind w:left="360"/>
+      </w:pPr>
+      <w:r>
+        <w:rPr>
+          <w:b/>
+          <w:bCs/>
+        </w:rPr>
+        <w:t xml:space="preserve">   B) </w:t>
+      </w:r>
+      <w:r>
+        <w:rPr>
+          <w:b/>
+          <w:bCs/>
+          <w:i/>
+          <w:iCs/>
+          <w:color w:val="92D050"/>
+        </w:rPr>
+        <w:t>Watering hole attack</w:t>
+      </w:r>
+    </w:p>
+    <w:p>
+      <w:pPr>
+        <w:spacing w:after="30"/>
+        <w:ind w:left="360"/>
+      </w:pPr>
+      <w:r>
+        <w:rPr>
+          <w:b/>
+          <w:bCs/>
+        </w:rPr>
+        <w:t xml:space="preserve">   C) </w:t>
+      </w:r>
+      <w:r>
+        <w:t>Pretexting</w:t>
+      </w:r>
+    </w:p>
+    <w:p>
+      <w:pPr>
+        <w:spacing w:after="30"/>
+        <w:ind w:left="360"/>
+      </w:pPr>
+      <w:r>
+        <w:rPr>
+          <w:b/>
+          <w:bCs/>
+        </w:rPr>
+        <w:t xml:space="preserve">   D) </w:t>
+      </w:r>
+      <w:r>
+        <w:t>Smishing</w:t>
+      </w:r>
+    </w:p>
+    <w:p>
+      <w:pPr>
+        <w:spacing w:before="120" w:after="60"/>
+      </w:pPr>
+      <w:r>
+        <w:rPr>
+          <w:b/>
+          <w:bCs/>
+          <w:color w:val="1F3864"/>
+        </w:rPr>
+        <w:t xml:space="preserve">Q10. </w:t>
+      </w:r>
+      <w:r>
+        <w:t>WannaCry spread so widely primarily because of:</w:t>
+      </w:r>
+    </w:p>
+    <w:p>
+      <w:pPr>
+        <w:spacing w:after="30"/>
+        <w:ind w:left="360"/>
+      </w:pPr>
+      <w:r>
+        <w:rPr>
+          <w:b/>
+          <w:bCs/>
+        </w:rPr>
+        <w:t xml:space="preserve">   A) </w:t>
+      </w:r>
+      <w:r>
+        <w:t>A zero-day no one could patch</w:t>
+      </w:r>
+    </w:p>
+    <w:p>
+      <w:pPr>
+        <w:spacing w:after="30"/>
+        <w:ind w:left="360"/>
+      </w:pPr>
+      <w:r>
+        <w:rPr>
+          <w:b/>
+          <w:bCs/>
+        </w:rPr>
+        <w:t xml:space="preserve">   B) </w:t>
+      </w:r>
+      <w:r>
+        <w:t>Users clicking malicious attachments</w:t>
+      </w:r>
+    </w:p>
+    <w:p>
+      <w:pPr>
+        <w:spacing w:after="30"/>
+        <w:ind w:left="360"/>
+        <w:rPr>
+          <w:color w:val="92D050"/>
+        </w:rPr>
+      </w:pPr>
+      <w:r>
+        <w:rPr>
+          <w:b/>
+          <w:bCs/>
+        </w:rPr>
+        <w:t xml:space="preserve">   C</w:t>
+      </w:r>
+      <w:r>
+        <w:rPr>
+          <w:b/>
+          <w:bCs/>
+          <w:color w:val="92D050"/>
+        </w:rPr>
+        <w:t>) Unpatched SMBv1 on Windows machines</w:t>
+      </w:r>
+    </w:p>
+    <w:p>
+      <w:pPr>
+        <w:spacing w:after="30"/>
+        <w:ind w:left="360"/>
+      </w:pPr>
+      <w:r>
+        <w:rPr>
+          <w:b/>
+          <w:bCs/>
+        </w:rPr>
+        <w:t xml:space="preserve">   D) </w:t>
+      </w:r>
+      <w:r>
+        <w:t>Weak passwords</w:t>
+      </w:r>
+    </w:p>
+    <w:p>
+      <w:pPr>
+        <w:spacing w:before="120" w:after="60"/>
+      </w:pPr>
+      <w:r>
+        <w:rPr>
+          <w:b/>
+          <w:bCs/>
+          <w:color w:val="1F3864"/>
+        </w:rPr>
+        <w:t xml:space="preserve">Q11. </w:t>
+      </w:r>
+      <w:r>
+        <w:t>Software running on an operating system the vendor no longer supports is best described as:</w:t>
+      </w:r>
+    </w:p>
+    <w:p>
+      <w:pPr>
+        <w:spacing w:after="30"/>
+        <w:ind w:left="360"/>
+      </w:pPr>
+      <w:r>
+        <w:rPr>
+          <w:b/>
+          <w:bCs/>
+        </w:rPr>
+        <w:t xml:space="preserve">   A) </w:t>
+      </w:r>
+      <w:r>
+        <w:t>Zero-day</w:t>
+      </w:r>
+    </w:p>
+    <w:p>
+      <w:pPr>
+        <w:spacing w:after="30"/>
+        <w:ind w:left="360"/>
+        <w:rPr>
+          <w:i/>
+          <w:iCs/>
+        </w:rPr>
+      </w:pPr>
+      <w:r>
+        <w:rPr>
+          <w:b/>
+          <w:bCs/>
+          <w:i/>
+          <w:iCs/>
+        </w:rPr>
+        <w:t xml:space="preserve">   B) </w:t>
+      </w:r>
+      <w:r>
+        <w:rPr>
+          <w:i/>
+          <w:iCs/>
+          <w:color w:val="92D050"/>
+        </w:rPr>
+        <w:t>Legacy / end-of-life</w:t>
+      </w:r>
+    </w:p>
+    <w:p>
+      <w:pPr>
+        <w:spacing w:after="30"/>
+        <w:ind w:left="360"/>
+      </w:pPr>
+      <w:r>
+        <w:rPr>
+          <w:b/>
+          <w:bCs/>
+        </w:rPr>
+        <w:t xml:space="preserve">   C) </w:t>
+      </w:r>
+      <w:r>
+        <w:t>Open source</w:t>
+      </w:r>
+    </w:p>
+    <w:p>
+      <w:pPr>
+        <w:spacing w:after="30"/>
+        <w:ind w:left="360"/>
+      </w:pPr>
+      <w:r>
+        <w:rPr>
+          <w:b/>
+          <w:bCs/>
+        </w:rPr>
+        <w:t xml:space="preserve">   D) </w:t>
+      </w:r>
+      <w:r>
+        <w:t>Beta</w:t>
+      </w:r>
+    </w:p>
+    <w:p>
+      <w:pPr>
+        <w:spacing w:before="120" w:after="60"/>
+      </w:pPr>
+      <w:r>
+        <w:rPr>
+          <w:b/>
+          <w:bCs/>
+          <w:color w:val="1F3864"/>
+        </w:rPr>
+        <w:t xml:space="preserve">Q12. </w:t>
+      </w:r>
+      <w:r>
+        <w:t xml:space="preserve">Which social engineering principle is at play when an email </w:t>
+      </w:r>
+      <w:proofErr w:type="gramStart"/>
+      <w:r>
+        <w:t>says</w:t>
+      </w:r>
+      <w:proofErr w:type="gramEnd"/>
+      <w:r>
+        <w:t xml:space="preserve"> "Your account will be closed in 24 hours"?</w:t>
+      </w:r>
+    </w:p>
+    <w:p>
+      <w:pPr>
+        <w:spacing w:after="30"/>
+        <w:ind w:left="360"/>
+      </w:pPr>
+      <w:r>
+        <w:rPr>
+          <w:b/>
+          <w:bCs/>
+        </w:rPr>
+        <w:t xml:space="preserve">   A) </w:t>
+      </w:r>
+      <w:r>
+        <w:t>Authority</w:t>
+      </w:r>
+    </w:p>
+    <w:p>
+      <w:pPr>
+        <w:spacing w:after="30"/>
+        <w:ind w:left="360"/>
+      </w:pPr>
+      <w:r>
+        <w:rPr>
+          <w:b/>
+          <w:bCs/>
+        </w:rPr>
+        <w:t xml:space="preserve">   B) </w:t>
+      </w:r>
+      <w:r>
+        <w:t>Scarcity</w:t>
+      </w:r>
+    </w:p>
+    <w:p>
+      <w:pPr>
+        <w:spacing w:after="30"/>
+        <w:ind w:left="360"/>
+        <w:rPr>
+          <w:i/>
+          <w:iCs/>
+          <w:color w:val="92D050"/>
+        </w:rPr>
+      </w:pPr>
+      <w:r>
+        <w:rPr>
+          <w:b/>
+          <w:bCs/>
+          <w:color w:val="92D050"/>
+        </w:rPr>
+        <w:t xml:space="preserve">   C) </w:t>
+      </w:r>
+      <w:r>
+        <w:rPr>
+          <w:color w:val="92D050"/>
+        </w:rPr>
+        <w:t>Urgency</w:t>
+      </w:r>
+    </w:p>
+    <w:p>
+      <w:pPr>
+        <w:spacing w:after="30"/>
+        <w:ind w:left="360"/>
+        <w:rPr>
+          <w:i/>
+          <w:iCs/>
+        </w:rPr>
+      </w:pPr>
+      <w:r>
+        <w:rPr>
+          <w:b/>
+          <w:bCs/>
+        </w:rPr>
+        <w:t xml:space="preserve">   D) </w:t>
+      </w:r>
+      <w:r>
+        <w:rPr>
+          <w:i/>
+          <w:iCs/>
+        </w:rPr>
+        <w:t>Social proof</w:t>
+      </w:r>
+    </w:p>
+    <w:p>
+      <w:pPr>
+        <w:spacing w:before="120" w:after="60"/>
+      </w:pPr>
+      <w:r>
+        <w:rPr>
+          <w:b/>
+          <w:bCs/>
+          <w:color w:val="1F3864"/>
+        </w:rPr>
+        <w:t xml:space="preserve">Q13. </w:t>
+      </w:r>
+      <w:r>
+        <w:t>An employee plugs in a USB stick they found in the parking lot. This is a vector known as:</w:t>
+      </w:r>
+    </w:p>
+    <w:p>
+      <w:pPr>
+        <w:spacing w:after="30"/>
+        <w:ind w:left="360"/>
+      </w:pPr>
+      <w:r>
+        <w:rPr>
+          <w:b/>
+          <w:bCs/>
+        </w:rPr>
+        <w:t xml:space="preserve">   A) </w:t>
+      </w:r>
+      <w:r>
+        <w:rPr>
+          <w:i/>
+          <w:iCs/>
+        </w:rPr>
+        <w:t>Supply chain</w:t>
+      </w:r>
+    </w:p>
+    <w:p>
+      <w:pPr>
+        <w:spacing w:after="30"/>
+        <w:ind w:left="360"/>
+        <w:rPr>
+          <w:color w:val="92D050"/>
+        </w:rPr>
+      </w:pPr>
+      <w:r>
+        <w:rPr>
+          <w:b/>
+          <w:bCs/>
+          <w:color w:val="92D050"/>
+        </w:rPr>
+        <w:t xml:space="preserve">   B) </w:t>
+      </w:r>
+      <w:r>
+        <w:rPr>
+          <w:color w:val="92D050"/>
+        </w:rPr>
+        <w:t>Removable media / baiting</w:t>
+      </w:r>
+    </w:p>
+    <w:p>
+      <w:pPr>
+        <w:spacing w:after="30"/>
+        <w:ind w:left="360"/>
+      </w:pPr>
+      <w:r>
+        <w:rPr>
+          <w:b/>
+          <w:bCs/>
+        </w:rPr>
+        <w:t xml:space="preserve">   C) </w:t>
+      </w:r>
+      <w:r>
+        <w:t>Watering hole</w:t>
+      </w:r>
+    </w:p>
+    <w:p>
+      <w:pPr>
+        <w:spacing w:after="30"/>
+        <w:ind w:left="360"/>
+      </w:pPr>
+      <w:r>
+        <w:rPr>
+          <w:b/>
+          <w:bCs/>
+        </w:rPr>
+        <w:t xml:space="preserve">   D) </w:t>
+      </w:r>
+      <w:r>
+        <w:t>Pretexting</w:t>
+      </w:r>
+    </w:p>
+    <w:p>
+      <w:pPr>
+        <w:spacing w:before="120" w:after="60"/>
+      </w:pPr>
+      <w:r>
+        <w:rPr>
+          <w:b/>
+          <w:bCs/>
+          <w:color w:val="1F3864"/>
+        </w:rPr>
+        <w:t xml:space="preserve">Q14. </w:t>
+      </w:r>
+      <w:r>
+        <w:t>Malware that runs entirely in memory using built-in tools like PowerShell is called:</w:t>
+      </w:r>
+    </w:p>
+    <w:p>
+      <w:pPr>
+        <w:spacing w:after="30"/>
+        <w:ind w:left="360"/>
+        <w:rPr>
+          <w:color w:val="92D050"/>
+        </w:rPr>
+      </w:pPr>
+      <w:r>
+        <w:rPr>
+          <w:b/>
+          <w:bCs/>
+          <w:color w:val="92D050"/>
+        </w:rPr>
+        <w:t xml:space="preserve">   A) </w:t>
+      </w:r>
+      <w:r>
+        <w:rPr>
+          <w:i/>
+          <w:iCs/>
+          <w:color w:val="92D050"/>
+        </w:rPr>
+        <w:t>Fileless malware</w:t>
+      </w:r>
+    </w:p>
+    <w:p>
+      <w:pPr>
+        <w:spacing w:after="30"/>
+        <w:ind w:left="360"/>
+      </w:pPr>
+      <w:r>
+        <w:rPr>
+          <w:b/>
+          <w:bCs/>
+        </w:rPr>
+        <w:lastRenderedPageBreak/>
+        <w:t xml:space="preserve">   B) </w:t>
+      </w:r>
+      <w:r>
+        <w:t>Trojan</w:t>
+      </w:r>
+    </w:p>
+    <w:p>
+      <w:pPr>
+        <w:spacing w:after="30"/>
+        <w:ind w:left="360"/>
+      </w:pPr>
+      <w:r>
+        <w:rPr>
+          <w:b/>
+          <w:bCs/>
+        </w:rPr>
+        <w:t xml:space="preserve">   C) </w:t>
+      </w:r>
+      <w:r>
+        <w:t>Macro virus</w:t>
+      </w:r>
+    </w:p>
+    <w:p>
+      <w:pPr>
+        <w:spacing w:after="30"/>
+        <w:ind w:left="360"/>
+      </w:pPr>
+      <w:r>
+        <w:rPr>
+          <w:b/>
+          <w:bCs/>
+        </w:rPr>
+        <w:t xml:space="preserve">   D) </w:t>
+      </w:r>
+      <w:r>
+        <w:t>Rootkit</w:t>
+      </w:r>
+    </w:p>
+    <w:p>
+      <w:pPr>
+        <w:spacing w:before="120" w:after="60"/>
+      </w:pPr>
+      <w:r>
+        <w:rPr>
+          <w:b/>
+          <w:bCs/>
+          <w:color w:val="1F3864"/>
+        </w:rPr>
+        <w:t xml:space="preserve">Q15. </w:t>
+      </w:r>
+      <w:r>
+        <w:t xml:space="preserve">The </w:t>
+      </w:r>
+      <w:proofErr w:type="spellStart"/>
+      <w:r>
+        <w:t>MOVEit</w:t>
+      </w:r>
+      <w:proofErr w:type="spellEnd"/>
+      <w:r>
+        <w:t xml:space="preserve"> incident is a textbook example of which threat vector?</w:t>
+      </w:r>
+    </w:p>
+    <w:p>
+      <w:pPr>
+        <w:spacing w:after="30"/>
+        <w:ind w:left="360"/>
+      </w:pPr>
+      <w:r>
+        <w:rPr>
+          <w:b/>
+          <w:bCs/>
+        </w:rPr>
+        <w:t xml:space="preserve">   A) </w:t>
+      </w:r>
+      <w:r>
+        <w:t>Phishing</w:t>
+      </w:r>
+    </w:p>
+    <w:p>
+      <w:pPr>
+        <w:spacing w:after="30"/>
+        <w:ind w:left="360"/>
+      </w:pPr>
+      <w:r>
+        <w:rPr>
+          <w:b/>
+          <w:bCs/>
+        </w:rPr>
+        <w:t xml:space="preserve">   B) </w:t>
+      </w:r>
+      <w:r>
+        <w:rPr>
+          <w:i/>
+          <w:iCs/>
+        </w:rPr>
+        <w:t>Insider threat</w:t>
+      </w:r>
+    </w:p>
+    <w:p>
+      <w:pPr>
+        <w:spacing w:after="30"/>
+        <w:ind w:left="360"/>
+      </w:pPr>
+      <w:r>
+        <w:rPr>
+          <w:b/>
+          <w:bCs/>
+        </w:rPr>
+        <w:t xml:space="preserve">   </w:t>
+      </w:r>
+      <w:r>
+        <w:rPr>
+          <w:b/>
+          <w:bCs/>
+          <w:color w:val="92D050"/>
+        </w:rPr>
+        <w:t xml:space="preserve">C) </w:t>
+      </w:r>
+      <w:r>
+        <w:rPr>
+          <w:color w:val="92D050"/>
+        </w:rPr>
+        <w:t>Supply-chain compromise</w:t>
+      </w:r>
+    </w:p>
+    <w:p>
+      <w:pPr>
+        <w:spacing w:after="30"/>
+        <w:ind w:left="360"/>
+      </w:pPr>
+      <w:r>
+        <w:rPr>
+          <w:b/>
+          <w:bCs/>
+        </w:rPr>
+        <w:t xml:space="preserve">   D) </w:t>
+      </w:r>
+      <w:r>
+        <w:t>Brute force</w:t>
+      </w:r>
+    </w:p>
+    <w:p>
+      <w:pPr>
+        <w:spacing w:before="120" w:after="60"/>
+      </w:pPr>
+      <w:r>
+        <w:rPr>
+          <w:b/>
+          <w:bCs/>
+          <w:color w:val="1F3864"/>
+        </w:rPr>
+        <w:t xml:space="preserve">Q16. </w:t>
+      </w:r>
+      <w:r>
+        <w:t>An employee using an unauthorized personal Dropbox account to share work files is an example of:</w:t>
+      </w:r>
+    </w:p>
+    <w:p>
+      <w:pPr>
+        <w:spacing w:after="30"/>
+        <w:ind w:left="360"/>
+      </w:pPr>
+      <w:r>
+        <w:rPr>
+          <w:b/>
+          <w:bCs/>
+        </w:rPr>
+        <w:t xml:space="preserve">   A) </w:t>
+      </w:r>
+      <w:r>
+        <w:t>Insider threat</w:t>
+      </w:r>
+    </w:p>
+    <w:p>
+      <w:pPr>
+        <w:spacing w:after="30"/>
+        <w:ind w:left="360"/>
+        <w:rPr>
+          <w:i/>
+          <w:iCs/>
+        </w:rPr>
+      </w:pPr>
+      <w:r>
+        <w:rPr>
+          <w:b/>
+          <w:bCs/>
+        </w:rPr>
+        <w:t xml:space="preserve">   </w:t>
+      </w:r>
+      <w:r>
+        <w:rPr>
+          <w:b/>
+          <w:bCs/>
+          <w:color w:val="92D050"/>
+        </w:rPr>
+        <w:t xml:space="preserve">B) </w:t>
+      </w:r>
+      <w:r>
+        <w:rPr>
+          <w:b/>
+          <w:bCs/>
+          <w:i/>
+          <w:iCs/>
+          <w:color w:val="92D050"/>
+        </w:rPr>
+        <w:t>Shadow IT</w:t>
+      </w:r>
+    </w:p>
+    <w:p>
+      <w:pPr>
+        <w:spacing w:after="30"/>
+        <w:ind w:left="360"/>
+      </w:pPr>
+      <w:r>
+        <w:rPr>
+          <w:b/>
+          <w:bCs/>
+        </w:rPr>
+        <w:t xml:space="preserve">   C) </w:t>
+      </w:r>
+      <w:r>
+        <w:t>Data exfiltration</w:t>
+      </w:r>
+    </w:p>
+    <w:p>
+      <w:pPr>
+        <w:spacing w:after="30"/>
+        <w:ind w:left="360"/>
+      </w:pPr>
+      <w:r>
+        <w:rPr>
+          <w:b/>
+          <w:bCs/>
+        </w:rPr>
+        <w:t xml:space="preserve">   D) </w:t>
+      </w:r>
+      <w:r>
+        <w:t>Privilege escalation</w:t>
+      </w:r>
+    </w:p>
+    <w:p>
+      <w:pPr>
+        <w:spacing w:before="120" w:after="60"/>
+      </w:pPr>
+      <w:r>
+        <w:rPr>
+          <w:b/>
+          <w:bCs/>
+          <w:color w:val="1F3864"/>
+        </w:rPr>
+        <w:t xml:space="preserve">Q17. </w:t>
+      </w:r>
+      <w:r>
+        <w:t>Which is NOT typically classified as malware?</w:t>
+      </w:r>
+    </w:p>
+    <w:p>
+      <w:pPr>
+        <w:spacing w:after="30"/>
+        <w:ind w:left="360"/>
+      </w:pPr>
+      <w:r>
+        <w:rPr>
+          <w:b/>
+          <w:bCs/>
+        </w:rPr>
+        <w:t xml:space="preserve">   A) </w:t>
+      </w:r>
+      <w:r>
+        <w:t>Ransomware</w:t>
+      </w:r>
+    </w:p>
+    <w:p>
+      <w:pPr>
+        <w:spacing w:after="30"/>
+        <w:ind w:left="360"/>
+      </w:pPr>
+      <w:r>
+        <w:rPr>
+          <w:b/>
+          <w:bCs/>
+        </w:rPr>
+        <w:t xml:space="preserve">   B) </w:t>
+      </w:r>
+      <w:r>
+        <w:t>Trojan</w:t>
+      </w:r>
+    </w:p>
+    <w:p>
+      <w:pPr>
+        <w:spacing w:after="30"/>
+        <w:ind w:left="360"/>
+        <w:rPr>
+          <w:color w:val="92D050"/>
+        </w:rPr>
+      </w:pPr>
+      <w:r>
+        <w:rPr>
+          <w:b/>
+          <w:bCs/>
+          <w:color w:val="92D050"/>
+        </w:rPr>
+        <w:t xml:space="preserve">   C) </w:t>
+      </w:r>
+      <w:r>
+        <w:rPr>
+          <w:i/>
+          <w:iCs/>
+          <w:color w:val="92D050"/>
+        </w:rPr>
+        <w:t>Firewall</w:t>
+      </w:r>
+    </w:p>
+    <w:p>
+      <w:pPr>
+        <w:spacing w:after="30"/>
+        <w:ind w:left="360"/>
+      </w:pPr>
+      <w:r>
+        <w:rPr>
+          <w:b/>
+          <w:bCs/>
+        </w:rPr>
+        <w:t xml:space="preserve">   D) </w:t>
+      </w:r>
+      <w:r>
+        <w:t>Rootkit</w:t>
+      </w:r>
+    </w:p>
+    <w:p>
+      <w:pPr>
+        <w:spacing w:before="120" w:after="60"/>
+      </w:pPr>
+      <w:r>
+        <w:rPr>
+          <w:b/>
+          <w:bCs/>
+          <w:color w:val="1F3864"/>
+        </w:rPr>
+        <w:t xml:space="preserve">Q18. </w:t>
+      </w:r>
+      <w:r>
+        <w:t>An attacker calls the helpdesk pretending to be a senior executive locked out of his account. This combines:</w:t>
+      </w:r>
+    </w:p>
+    <w:p>
+      <w:pPr>
+        <w:spacing w:after="30"/>
+        <w:ind w:left="360"/>
+        <w:rPr>
+          <w:color w:val="92D050"/>
+        </w:rPr>
+      </w:pPr>
+      <w:r>
+        <w:rPr>
+          <w:b/>
+          <w:bCs/>
+          <w:color w:val="92D050"/>
+        </w:rPr>
+        <w:t xml:space="preserve">   A) </w:t>
+      </w:r>
+      <w:r>
+        <w:rPr>
+          <w:i/>
+          <w:iCs/>
+          <w:color w:val="92D050"/>
+        </w:rPr>
+        <w:t>Vishing and pretexting (with authority)</w:t>
+      </w:r>
+    </w:p>
+    <w:p>
+      <w:pPr>
+        <w:spacing w:after="30"/>
+        <w:ind w:left="360"/>
+      </w:pPr>
+      <w:r>
+        <w:rPr>
+          <w:b/>
+          <w:bCs/>
+        </w:rPr>
+        <w:t xml:space="preserve">   B) </w:t>
+      </w:r>
+      <w:r>
+        <w:t>Phishing and smishing</w:t>
+      </w:r>
+    </w:p>
+    <w:p>
+      <w:pPr>
+        <w:spacing w:after="30"/>
+        <w:ind w:left="360"/>
+      </w:pPr>
+      <w:r>
+        <w:rPr>
+          <w:b/>
+          <w:bCs/>
+        </w:rPr>
+        <w:t xml:space="preserve">   C) </w:t>
+      </w:r>
+      <w:r>
+        <w:t>Whaling and spear phishing</w:t>
+      </w:r>
+    </w:p>
+    <w:p>
+      <w:pPr>
+        <w:spacing w:after="30"/>
+        <w:ind w:left="360"/>
+      </w:pPr>
+      <w:r>
+        <w:rPr>
+          <w:b/>
+          <w:bCs/>
+        </w:rPr>
+        <w:t xml:space="preserve">   D) </w:t>
+      </w:r>
+      <w:r>
+        <w:t>Baiting and tailgating</w:t>
+      </w:r>
+    </w:p>
+    <w:p>
+      <w:pPr>
+        <w:spacing w:before="120" w:after="60"/>
+      </w:pPr>
+      <w:r>
+        <w:rPr>
+          <w:b/>
+          <w:bCs/>
+          <w:color w:val="1F3864"/>
+        </w:rPr>
+        <w:t xml:space="preserve">Q19. </w:t>
+      </w:r>
+      <w:r>
+        <w:t>Hardcoded credentials in an IoT device firmware are best classified as a:</w:t>
+      </w:r>
+    </w:p>
+    <w:p>
+      <w:pPr>
+        <w:spacing w:after="30"/>
+        <w:ind w:left="360"/>
+      </w:pPr>
+      <w:r>
+        <w:rPr>
+          <w:b/>
+          <w:bCs/>
+        </w:rPr>
+        <w:t xml:space="preserve">   A) </w:t>
+      </w:r>
+      <w:r>
+        <w:t>Zero-day</w:t>
+      </w:r>
+    </w:p>
+    <w:p>
+      <w:pPr>
+        <w:spacing w:after="30"/>
+        <w:ind w:left="360"/>
+      </w:pPr>
+      <w:r>
+        <w:rPr>
+          <w:b/>
+          <w:bCs/>
+        </w:rPr>
+        <w:t xml:space="preserve">   B) </w:t>
+      </w:r>
+      <w:r>
+        <w:t>Misconfiguration</w:t>
+      </w:r>
+    </w:p>
+    <w:p>
+      <w:pPr>
+        <w:spacing w:after="30"/>
+        <w:ind w:left="360"/>
+        <w:rPr>
+          <w:color w:val="92D050"/>
+        </w:rPr>
+      </w:pPr>
+      <w:r>
+        <w:rPr>
+          <w:b/>
+          <w:bCs/>
+          <w:color w:val="92D050"/>
+        </w:rPr>
+        <w:t xml:space="preserve">   C) </w:t>
+      </w:r>
+      <w:r>
+        <w:rPr>
+          <w:i/>
+          <w:iCs/>
+          <w:color w:val="92D050"/>
+        </w:rPr>
+        <w:t>Built-in vulnerability</w:t>
+      </w:r>
+    </w:p>
+    <w:p>
+      <w:pPr>
+        <w:spacing w:after="30"/>
+        <w:ind w:left="360"/>
+      </w:pPr>
+      <w:r>
+        <w:rPr>
+          <w:b/>
+          <w:bCs/>
+        </w:rPr>
+        <w:t xml:space="preserve">   D) </w:t>
+      </w:r>
+      <w:r>
+        <w:t>Legacy issue</w:t>
+      </w:r>
+    </w:p>
+    <w:p>
+      <w:pPr>
+        <w:spacing w:before="120" w:after="60"/>
+      </w:pPr>
+      <w:r>
+        <w:rPr>
+          <w:b/>
+          <w:bCs/>
+          <w:color w:val="1F3864"/>
+        </w:rPr>
+        <w:t xml:space="preserve">Q20. </w:t>
+      </w:r>
+      <w:r>
+        <w:t>An attacker steals data and threatens to publish it unless paid, without encrypting anything. This is:</w:t>
+      </w:r>
+    </w:p>
+    <w:p>
+      <w:pPr>
+        <w:spacing w:after="30"/>
+        <w:ind w:left="360"/>
+      </w:pPr>
+      <w:r>
+        <w:rPr>
+          <w:b/>
+          <w:bCs/>
+        </w:rPr>
+        <w:t xml:space="preserve">   A) </w:t>
+      </w:r>
+      <w:r>
+        <w:t>Classic ransomware</w:t>
+      </w:r>
+    </w:p>
+    <w:p>
+      <w:pPr>
+        <w:spacing w:after="30"/>
+        <w:ind w:left="360"/>
+        <w:rPr>
+          <w:color w:val="92D050"/>
+        </w:rPr>
+      </w:pPr>
+      <w:r>
+        <w:rPr>
+          <w:b/>
+          <w:bCs/>
+          <w:color w:val="92D050"/>
+        </w:rPr>
+        <w:t xml:space="preserve">   B) </w:t>
+      </w:r>
+      <w:proofErr w:type="spellStart"/>
+      <w:r>
+        <w:rPr>
+          <w:color w:val="92D050"/>
+        </w:rPr>
+        <w:t>Extortionware</w:t>
+      </w:r>
+      <w:proofErr w:type="spellEnd"/>
+      <w:r>
+        <w:rPr>
+          <w:color w:val="92D050"/>
+        </w:rPr>
+        <w:t xml:space="preserve"> / data leak extortion</w:t>
+      </w:r>
+    </w:p>
+    <w:p>
+      <w:pPr>
+        <w:spacing w:after="30"/>
+        <w:ind w:left="360"/>
+      </w:pPr>
+      <w:r>
+        <w:rPr>
+          <w:b/>
+          <w:bCs/>
+        </w:rPr>
+        <w:t xml:space="preserve">   C) </w:t>
+      </w:r>
+      <w:r>
+        <w:rPr>
+          <w:i/>
+          <w:iCs/>
+        </w:rPr>
+        <w:t>Logic bomb</w:t>
+      </w:r>
+    </w:p>
+    <w:p>
+      <w:pPr>
+        <w:spacing w:after="30"/>
+        <w:ind w:left="360"/>
+      </w:pPr>
+      <w:r>
+        <w:rPr>
+          <w:b/>
+          <w:bCs/>
+        </w:rPr>
+        <w:t xml:space="preserve">   D) </w:t>
+      </w:r>
+      <w:r>
+        <w:t>Cryptojacking</w:t>
+      </w:r>
+    </w:p>
+    <w:p/>
     <w:p>
       <w:r>
         <w:br w:type="page"/>
@@ -10067,6 +11906,7 @@
   <w:style w:type="character" w:default="1" w:styleId="DefaultParagraphFont">
     <w:name w:val="Default Paragraph Font"/>
     <w:uiPriority w:val="1"/>
+    <w:semiHidden/>
     <w:unhideWhenUsed/>
   </w:style>
   <w:style w:type="table" w:default="1" w:styleId="TableNormal">

</xml_diff>